<commit_message>
Changed Preprocessing steps> Mistakenly earlier we applied perprocessor pipeline on entire data and then splitted which we changed to fit_transform on train data and transform on test data
</commit_message>
<xml_diff>
--- a/00_Ipl_win_prediction initial git and dvc commands.docx
+++ b/00_Ipl_win_prediction initial git and dvc commands.docx
@@ -974,6 +974,33 @@
     </w:p>
     <w:p>
       <w:pPr>
+        <w:rPr>
+          <w:sz w:val="36"/>
+          <w:szCs w:val="36"/>
+          <w:lang w:val="en-US"/>
+        </w:rPr>
+      </w:pPr>
+    </w:p>
+    <w:p>
+      <w:pPr>
+        <w:rPr>
+          <w:sz w:val="36"/>
+          <w:szCs w:val="36"/>
+          <w:lang w:val="en-US"/>
+        </w:rPr>
+      </w:pPr>
+    </w:p>
+    <w:p>
+      <w:pPr>
+        <w:rPr>
+          <w:sz w:val="36"/>
+          <w:szCs w:val="36"/>
+          <w:lang w:val="en-US"/>
+        </w:rPr>
+      </w:pPr>
+    </w:p>
+    <w:p>
+      <w:pPr>
         <w:pStyle w:val="ListParagraph"/>
         <w:numPr>
           <w:ilvl w:val="0"/>
@@ -985,6 +1012,841 @@
           <w:lang w:val="en-US"/>
         </w:rPr>
       </w:pPr>
+      <w:r>
+        <w:rPr>
+          <w:sz w:val="36"/>
+          <w:szCs w:val="36"/>
+          <w:lang w:val="en-US"/>
+        </w:rPr>
+        <w:lastRenderedPageBreak/>
+        <w:t>Update dvc.yaml with 1</w:t>
+      </w:r>
+      <w:r>
+        <w:rPr>
+          <w:sz w:val="36"/>
+          <w:szCs w:val="36"/>
+          <w:vertAlign w:val="superscript"/>
+          <w:lang w:val="en-US"/>
+        </w:rPr>
+        <w:t>st</w:t>
+      </w:r>
+      <w:r>
+        <w:rPr>
+          <w:sz w:val="36"/>
+          <w:szCs w:val="36"/>
+          <w:lang w:val="en-US"/>
+        </w:rPr>
+        <w:t xml:space="preserve"> stage:</w:t>
+      </w:r>
+    </w:p>
+    <w:p>
+      <w:pPr>
+        <w:shd w:val="clear" w:color="auto" w:fill="1F1F1F"/>
+        <w:spacing w:after="0" w:line="405" w:lineRule="atLeast"/>
+        <w:rPr>
+          <w:rFonts w:ascii="Verdana" w:eastAsia="Times New Roman" w:hAnsi="Verdana" w:cs="Times New Roman"/>
+          <w:color w:val="CCCCCC"/>
+          <w:kern w:val="0"/>
+          <w:sz w:val="30"/>
+          <w:szCs w:val="30"/>
+          <w:lang w:eastAsia="en-IN"/>
+          <w14:ligatures w14:val="none"/>
+        </w:rPr>
+      </w:pPr>
+      <w:r>
+        <w:rPr>
+          <w:rFonts w:ascii="Verdana" w:eastAsia="Times New Roman" w:hAnsi="Verdana" w:cs="Times New Roman"/>
+          <w:color w:val="569CD6"/>
+          <w:kern w:val="0"/>
+          <w:sz w:val="30"/>
+          <w:szCs w:val="30"/>
+          <w:lang w:eastAsia="en-IN"/>
+          <w14:ligatures w14:val="none"/>
+        </w:rPr>
+        <w:t>stages</w:t>
+      </w:r>
+      <w:r>
+        <w:rPr>
+          <w:rFonts w:ascii="Verdana" w:eastAsia="Times New Roman" w:hAnsi="Verdana" w:cs="Times New Roman"/>
+          <w:color w:val="CCCCCC"/>
+          <w:kern w:val="0"/>
+          <w:sz w:val="30"/>
+          <w:szCs w:val="30"/>
+          <w:lang w:eastAsia="en-IN"/>
+          <w14:ligatures w14:val="none"/>
+        </w:rPr>
+        <w:t>:</w:t>
+      </w:r>
+    </w:p>
+    <w:p>
+      <w:pPr>
+        <w:shd w:val="clear" w:color="auto" w:fill="1F1F1F"/>
+        <w:spacing w:after="0" w:line="405" w:lineRule="atLeast"/>
+        <w:rPr>
+          <w:rFonts w:ascii="Verdana" w:eastAsia="Times New Roman" w:hAnsi="Verdana" w:cs="Times New Roman"/>
+          <w:color w:val="CCCCCC"/>
+          <w:kern w:val="0"/>
+          <w:sz w:val="30"/>
+          <w:szCs w:val="30"/>
+          <w:lang w:eastAsia="en-IN"/>
+          <w14:ligatures w14:val="none"/>
+        </w:rPr>
+      </w:pPr>
+      <w:r>
+        <w:rPr>
+          <w:rFonts w:ascii="Verdana" w:eastAsia="Times New Roman" w:hAnsi="Verdana" w:cs="Times New Roman"/>
+          <w:color w:val="CCCCCC"/>
+          <w:kern w:val="0"/>
+          <w:sz w:val="30"/>
+          <w:szCs w:val="30"/>
+          <w:lang w:eastAsia="en-IN"/>
+          <w14:ligatures w14:val="none"/>
+        </w:rPr>
+        <w:t xml:space="preserve">    </w:t>
+      </w:r>
+      <w:r>
+        <w:rPr>
+          <w:rFonts w:ascii="Verdana" w:eastAsia="Times New Roman" w:hAnsi="Verdana" w:cs="Times New Roman"/>
+          <w:color w:val="569CD6"/>
+          <w:kern w:val="0"/>
+          <w:sz w:val="30"/>
+          <w:szCs w:val="30"/>
+          <w:lang w:eastAsia="en-IN"/>
+          <w14:ligatures w14:val="none"/>
+        </w:rPr>
+        <w:t>load_data</w:t>
+      </w:r>
+      <w:r>
+        <w:rPr>
+          <w:rFonts w:ascii="Verdana" w:eastAsia="Times New Roman" w:hAnsi="Verdana" w:cs="Times New Roman"/>
+          <w:color w:val="CCCCCC"/>
+          <w:kern w:val="0"/>
+          <w:sz w:val="30"/>
+          <w:szCs w:val="30"/>
+          <w:lang w:eastAsia="en-IN"/>
+          <w14:ligatures w14:val="none"/>
+        </w:rPr>
+        <w:t>:</w:t>
+      </w:r>
+    </w:p>
+    <w:p>
+      <w:pPr>
+        <w:shd w:val="clear" w:color="auto" w:fill="1F1F1F"/>
+        <w:spacing w:after="0" w:line="405" w:lineRule="atLeast"/>
+        <w:rPr>
+          <w:rFonts w:ascii="Verdana" w:eastAsia="Times New Roman" w:hAnsi="Verdana" w:cs="Times New Roman"/>
+          <w:color w:val="CCCCCC"/>
+          <w:kern w:val="0"/>
+          <w:sz w:val="30"/>
+          <w:szCs w:val="30"/>
+          <w:lang w:eastAsia="en-IN"/>
+          <w14:ligatures w14:val="none"/>
+        </w:rPr>
+      </w:pPr>
+      <w:r>
+        <w:rPr>
+          <w:rFonts w:ascii="Verdana" w:eastAsia="Times New Roman" w:hAnsi="Verdana" w:cs="Times New Roman"/>
+          <w:color w:val="CCCCCC"/>
+          <w:kern w:val="0"/>
+          <w:sz w:val="30"/>
+          <w:szCs w:val="30"/>
+          <w:lang w:eastAsia="en-IN"/>
+          <w14:ligatures w14:val="none"/>
+        </w:rPr>
+        <w:t xml:space="preserve">        </w:t>
+      </w:r>
+      <w:r>
+        <w:rPr>
+          <w:rFonts w:ascii="Verdana" w:eastAsia="Times New Roman" w:hAnsi="Verdana" w:cs="Times New Roman"/>
+          <w:color w:val="569CD6"/>
+          <w:kern w:val="0"/>
+          <w:sz w:val="30"/>
+          <w:szCs w:val="30"/>
+          <w:lang w:eastAsia="en-IN"/>
+          <w14:ligatures w14:val="none"/>
+        </w:rPr>
+        <w:t>cmd</w:t>
+      </w:r>
+      <w:r>
+        <w:rPr>
+          <w:rFonts w:ascii="Verdana" w:eastAsia="Times New Roman" w:hAnsi="Verdana" w:cs="Times New Roman"/>
+          <w:color w:val="CCCCCC"/>
+          <w:kern w:val="0"/>
+          <w:sz w:val="30"/>
+          <w:szCs w:val="30"/>
+          <w:lang w:eastAsia="en-IN"/>
+          <w14:ligatures w14:val="none"/>
+        </w:rPr>
+        <w:t xml:space="preserve">: </w:t>
+      </w:r>
+      <w:r>
+        <w:rPr>
+          <w:rFonts w:ascii="Verdana" w:eastAsia="Times New Roman" w:hAnsi="Verdana" w:cs="Times New Roman"/>
+          <w:color w:val="CE9178"/>
+          <w:kern w:val="0"/>
+          <w:sz w:val="30"/>
+          <w:szCs w:val="30"/>
+          <w:lang w:eastAsia="en-IN"/>
+          <w14:ligatures w14:val="none"/>
+        </w:rPr>
+        <w:t>python src/load_data.py --config params.yaml</w:t>
+      </w:r>
+    </w:p>
+    <w:p>
+      <w:pPr>
+        <w:shd w:val="clear" w:color="auto" w:fill="1F1F1F"/>
+        <w:spacing w:after="0" w:line="405" w:lineRule="atLeast"/>
+        <w:rPr>
+          <w:rFonts w:ascii="Verdana" w:eastAsia="Times New Roman" w:hAnsi="Verdana" w:cs="Times New Roman"/>
+          <w:color w:val="CCCCCC"/>
+          <w:kern w:val="0"/>
+          <w:sz w:val="30"/>
+          <w:szCs w:val="30"/>
+          <w:lang w:eastAsia="en-IN"/>
+          <w14:ligatures w14:val="none"/>
+        </w:rPr>
+      </w:pPr>
+      <w:r>
+        <w:rPr>
+          <w:rFonts w:ascii="Verdana" w:eastAsia="Times New Roman" w:hAnsi="Verdana" w:cs="Times New Roman"/>
+          <w:color w:val="CCCCCC"/>
+          <w:kern w:val="0"/>
+          <w:sz w:val="30"/>
+          <w:szCs w:val="30"/>
+          <w:lang w:eastAsia="en-IN"/>
+          <w14:ligatures w14:val="none"/>
+        </w:rPr>
+        <w:t xml:space="preserve">        </w:t>
+      </w:r>
+      <w:r>
+        <w:rPr>
+          <w:rFonts w:ascii="Verdana" w:eastAsia="Times New Roman" w:hAnsi="Verdana" w:cs="Times New Roman"/>
+          <w:color w:val="569CD6"/>
+          <w:kern w:val="0"/>
+          <w:sz w:val="30"/>
+          <w:szCs w:val="30"/>
+          <w:lang w:eastAsia="en-IN"/>
+          <w14:ligatures w14:val="none"/>
+        </w:rPr>
+        <w:t>deps</w:t>
+      </w:r>
+      <w:r>
+        <w:rPr>
+          <w:rFonts w:ascii="Verdana" w:eastAsia="Times New Roman" w:hAnsi="Verdana" w:cs="Times New Roman"/>
+          <w:color w:val="CCCCCC"/>
+          <w:kern w:val="0"/>
+          <w:sz w:val="30"/>
+          <w:szCs w:val="30"/>
+          <w:lang w:eastAsia="en-IN"/>
+          <w14:ligatures w14:val="none"/>
+        </w:rPr>
+        <w:t>:</w:t>
+      </w:r>
+    </w:p>
+    <w:p>
+      <w:pPr>
+        <w:shd w:val="clear" w:color="auto" w:fill="1F1F1F"/>
+        <w:spacing w:after="0" w:line="405" w:lineRule="atLeast"/>
+        <w:rPr>
+          <w:rFonts w:ascii="Verdana" w:eastAsia="Times New Roman" w:hAnsi="Verdana" w:cs="Times New Roman"/>
+          <w:color w:val="CCCCCC"/>
+          <w:kern w:val="0"/>
+          <w:sz w:val="30"/>
+          <w:szCs w:val="30"/>
+          <w:lang w:eastAsia="en-IN"/>
+          <w14:ligatures w14:val="none"/>
+        </w:rPr>
+      </w:pPr>
+      <w:r>
+        <w:rPr>
+          <w:rFonts w:ascii="Verdana" w:eastAsia="Times New Roman" w:hAnsi="Verdana" w:cs="Times New Roman"/>
+          <w:color w:val="CCCCCC"/>
+          <w:kern w:val="0"/>
+          <w:sz w:val="30"/>
+          <w:szCs w:val="30"/>
+          <w:lang w:eastAsia="en-IN"/>
+          <w14:ligatures w14:val="none"/>
+        </w:rPr>
+        <w:t xml:space="preserve">            - </w:t>
+      </w:r>
+      <w:r>
+        <w:rPr>
+          <w:rFonts w:ascii="Verdana" w:eastAsia="Times New Roman" w:hAnsi="Verdana" w:cs="Times New Roman"/>
+          <w:color w:val="CE9178"/>
+          <w:kern w:val="0"/>
+          <w:sz w:val="30"/>
+          <w:szCs w:val="30"/>
+          <w:lang w:eastAsia="en-IN"/>
+          <w14:ligatures w14:val="none"/>
+        </w:rPr>
+        <w:t>src/load_data.py</w:t>
+      </w:r>
+    </w:p>
+    <w:p>
+      <w:pPr>
+        <w:shd w:val="clear" w:color="auto" w:fill="1F1F1F"/>
+        <w:spacing w:after="0" w:line="405" w:lineRule="atLeast"/>
+        <w:rPr>
+          <w:rFonts w:ascii="Verdana" w:eastAsia="Times New Roman" w:hAnsi="Verdana" w:cs="Times New Roman"/>
+          <w:color w:val="CCCCCC"/>
+          <w:kern w:val="0"/>
+          <w:sz w:val="30"/>
+          <w:szCs w:val="30"/>
+          <w:lang w:eastAsia="en-IN"/>
+          <w14:ligatures w14:val="none"/>
+        </w:rPr>
+      </w:pPr>
+      <w:r>
+        <w:rPr>
+          <w:rFonts w:ascii="Verdana" w:eastAsia="Times New Roman" w:hAnsi="Verdana" w:cs="Times New Roman"/>
+          <w:color w:val="CCCCCC"/>
+          <w:kern w:val="0"/>
+          <w:sz w:val="30"/>
+          <w:szCs w:val="30"/>
+          <w:lang w:eastAsia="en-IN"/>
+          <w14:ligatures w14:val="none"/>
+        </w:rPr>
+        <w:t xml:space="preserve">            - </w:t>
+      </w:r>
+      <w:r>
+        <w:rPr>
+          <w:rFonts w:ascii="Verdana" w:eastAsia="Times New Roman" w:hAnsi="Verdana" w:cs="Times New Roman"/>
+          <w:color w:val="CE9178"/>
+          <w:kern w:val="0"/>
+          <w:sz w:val="30"/>
+          <w:szCs w:val="30"/>
+          <w:lang w:eastAsia="en-IN"/>
+          <w14:ligatures w14:val="none"/>
+        </w:rPr>
+        <w:t>src/read_data.py</w:t>
+      </w:r>
+    </w:p>
+    <w:p>
+      <w:pPr>
+        <w:shd w:val="clear" w:color="auto" w:fill="1F1F1F"/>
+        <w:spacing w:after="0" w:line="405" w:lineRule="atLeast"/>
+        <w:rPr>
+          <w:rFonts w:ascii="Verdana" w:eastAsia="Times New Roman" w:hAnsi="Verdana" w:cs="Times New Roman"/>
+          <w:color w:val="CCCCCC"/>
+          <w:kern w:val="0"/>
+          <w:sz w:val="30"/>
+          <w:szCs w:val="30"/>
+          <w:lang w:eastAsia="en-IN"/>
+          <w14:ligatures w14:val="none"/>
+        </w:rPr>
+      </w:pPr>
+      <w:r>
+        <w:rPr>
+          <w:rFonts w:ascii="Verdana" w:eastAsia="Times New Roman" w:hAnsi="Verdana" w:cs="Times New Roman"/>
+          <w:color w:val="CCCCCC"/>
+          <w:kern w:val="0"/>
+          <w:sz w:val="30"/>
+          <w:szCs w:val="30"/>
+          <w:lang w:eastAsia="en-IN"/>
+          <w14:ligatures w14:val="none"/>
+        </w:rPr>
+        <w:t xml:space="preserve">            - </w:t>
+      </w:r>
+      <w:r>
+        <w:rPr>
+          <w:rFonts w:ascii="Verdana" w:eastAsia="Times New Roman" w:hAnsi="Verdana" w:cs="Times New Roman"/>
+          <w:color w:val="CE9178"/>
+          <w:kern w:val="0"/>
+          <w:sz w:val="30"/>
+          <w:szCs w:val="30"/>
+          <w:lang w:eastAsia="en-IN"/>
+          <w14:ligatures w14:val="none"/>
+        </w:rPr>
+        <w:t>original_data/ipl_dataset.csv</w:t>
+      </w:r>
+    </w:p>
+    <w:p>
+      <w:pPr>
+        <w:shd w:val="clear" w:color="auto" w:fill="1F1F1F"/>
+        <w:spacing w:after="0" w:line="405" w:lineRule="atLeast"/>
+        <w:rPr>
+          <w:rFonts w:ascii="Verdana" w:eastAsia="Times New Roman" w:hAnsi="Verdana" w:cs="Times New Roman"/>
+          <w:color w:val="CCCCCC"/>
+          <w:kern w:val="0"/>
+          <w:sz w:val="30"/>
+          <w:szCs w:val="30"/>
+          <w:lang w:eastAsia="en-IN"/>
+          <w14:ligatures w14:val="none"/>
+        </w:rPr>
+      </w:pPr>
+      <w:r>
+        <w:rPr>
+          <w:rFonts w:ascii="Verdana" w:eastAsia="Times New Roman" w:hAnsi="Verdana" w:cs="Times New Roman"/>
+          <w:color w:val="CCCCCC"/>
+          <w:kern w:val="0"/>
+          <w:sz w:val="30"/>
+          <w:szCs w:val="30"/>
+          <w:lang w:eastAsia="en-IN"/>
+          <w14:ligatures w14:val="none"/>
+        </w:rPr>
+        <w:t xml:space="preserve">        </w:t>
+      </w:r>
+      <w:r>
+        <w:rPr>
+          <w:rFonts w:ascii="Verdana" w:eastAsia="Times New Roman" w:hAnsi="Verdana" w:cs="Times New Roman"/>
+          <w:color w:val="569CD6"/>
+          <w:kern w:val="0"/>
+          <w:sz w:val="30"/>
+          <w:szCs w:val="30"/>
+          <w:lang w:eastAsia="en-IN"/>
+          <w14:ligatures w14:val="none"/>
+        </w:rPr>
+        <w:t>outs</w:t>
+      </w:r>
+      <w:r>
+        <w:rPr>
+          <w:rFonts w:ascii="Verdana" w:eastAsia="Times New Roman" w:hAnsi="Verdana" w:cs="Times New Roman"/>
+          <w:color w:val="CCCCCC"/>
+          <w:kern w:val="0"/>
+          <w:sz w:val="30"/>
+          <w:szCs w:val="30"/>
+          <w:lang w:eastAsia="en-IN"/>
+          <w14:ligatures w14:val="none"/>
+        </w:rPr>
+        <w:t>:</w:t>
+      </w:r>
+    </w:p>
+    <w:p>
+      <w:pPr>
+        <w:shd w:val="clear" w:color="auto" w:fill="1F1F1F"/>
+        <w:spacing w:after="0" w:line="405" w:lineRule="atLeast"/>
+        <w:rPr>
+          <w:rFonts w:ascii="Verdana" w:eastAsia="Times New Roman" w:hAnsi="Verdana" w:cs="Times New Roman"/>
+          <w:color w:val="CCCCCC"/>
+          <w:kern w:val="0"/>
+          <w:sz w:val="30"/>
+          <w:szCs w:val="30"/>
+          <w:lang w:eastAsia="en-IN"/>
+          <w14:ligatures w14:val="none"/>
+        </w:rPr>
+      </w:pPr>
+      <w:r>
+        <w:rPr>
+          <w:rFonts w:ascii="Verdana" w:eastAsia="Times New Roman" w:hAnsi="Verdana" w:cs="Times New Roman"/>
+          <w:color w:val="CCCCCC"/>
+          <w:kern w:val="0"/>
+          <w:sz w:val="30"/>
+          <w:szCs w:val="30"/>
+          <w:lang w:eastAsia="en-IN"/>
+          <w14:ligatures w14:val="none"/>
+        </w:rPr>
+        <w:t xml:space="preserve">              - </w:t>
+      </w:r>
+      <w:r>
+        <w:rPr>
+          <w:rFonts w:ascii="Verdana" w:eastAsia="Times New Roman" w:hAnsi="Verdana" w:cs="Times New Roman"/>
+          <w:color w:val="CE9178"/>
+          <w:kern w:val="0"/>
+          <w:sz w:val="30"/>
+          <w:szCs w:val="30"/>
+          <w:lang w:eastAsia="en-IN"/>
+          <w14:ligatures w14:val="none"/>
+        </w:rPr>
+        <w:t>data\raw/raw_ipl_dataset.csv</w:t>
+      </w:r>
+    </w:p>
+    <w:p>
+      <w:pPr>
+        <w:shd w:val="clear" w:color="auto" w:fill="1F1F1F"/>
+        <w:spacing w:after="0" w:line="405" w:lineRule="atLeast"/>
+        <w:rPr>
+          <w:rFonts w:ascii="Verdana" w:eastAsia="Times New Roman" w:hAnsi="Verdana" w:cs="Times New Roman"/>
+          <w:color w:val="CCCCCC"/>
+          <w:kern w:val="0"/>
+          <w:sz w:val="30"/>
+          <w:szCs w:val="30"/>
+          <w:lang w:eastAsia="en-IN"/>
+          <w14:ligatures w14:val="none"/>
+        </w:rPr>
+      </w:pPr>
+    </w:p>
+    <w:p>
+      <w:pPr>
+        <w:rPr>
+          <w:sz w:val="36"/>
+          <w:szCs w:val="36"/>
+          <w:lang w:val="en-US"/>
+        </w:rPr>
+      </w:pPr>
+    </w:p>
+    <w:p>
+      <w:pPr>
+        <w:pStyle w:val="ListParagraph"/>
+        <w:numPr>
+          <w:ilvl w:val="0"/>
+          <w:numId w:val="4"/>
+        </w:numPr>
+        <w:rPr>
+          <w:sz w:val="36"/>
+          <w:szCs w:val="36"/>
+          <w:lang w:val="en-US"/>
+        </w:rPr>
+      </w:pPr>
+      <w:r>
+        <w:rPr>
+          <w:sz w:val="36"/>
+          <w:szCs w:val="36"/>
+          <w:lang w:val="en-US"/>
+        </w:rPr>
+        <w:t>Run: dvc repro</w:t>
+      </w:r>
+    </w:p>
+    <w:p>
+      <w:pPr>
+        <w:pStyle w:val="ListParagraph"/>
+        <w:numPr>
+          <w:ilvl w:val="1"/>
+          <w:numId w:val="4"/>
+        </w:numPr>
+        <w:rPr>
+          <w:sz w:val="36"/>
+          <w:szCs w:val="36"/>
+          <w:lang w:val="en-US"/>
+        </w:rPr>
+      </w:pPr>
+      <w:r>
+        <w:rPr>
+          <w:sz w:val="36"/>
+          <w:szCs w:val="36"/>
+          <w:lang w:val="en-US"/>
+        </w:rPr>
+        <w:t>This will generate a dvc.lock file.</w:t>
+      </w:r>
+    </w:p>
+    <w:p>
+      <w:pPr>
+        <w:pStyle w:val="ListParagraph"/>
+        <w:numPr>
+          <w:ilvl w:val="1"/>
+          <w:numId w:val="4"/>
+        </w:numPr>
+        <w:rPr>
+          <w:sz w:val="36"/>
+          <w:szCs w:val="36"/>
+          <w:lang w:val="en-US"/>
+        </w:rPr>
+      </w:pPr>
+      <w:r>
+        <w:rPr>
+          <w:sz w:val="36"/>
+          <w:szCs w:val="36"/>
+          <w:lang w:val="en-US"/>
+        </w:rPr>
+        <w:t xml:space="preserve">Automatically add the saved </w:t>
+      </w:r>
+      <w:r>
+        <w:rPr>
+          <w:b/>
+          <w:bCs/>
+          <w:sz w:val="36"/>
+          <w:szCs w:val="36"/>
+          <w:lang w:val="en-US"/>
+        </w:rPr>
+        <w:t>data/raw/raw_ipldataset.csv</w:t>
+      </w:r>
+      <w:r>
+        <w:rPr>
+          <w:sz w:val="36"/>
+          <w:szCs w:val="36"/>
+          <w:lang w:val="en-US"/>
+        </w:rPr>
+        <w:t xml:space="preserve"> in </w:t>
+      </w:r>
+      <w:r>
+        <w:rPr>
+          <w:b/>
+          <w:bCs/>
+          <w:sz w:val="36"/>
+          <w:szCs w:val="36"/>
+          <w:lang w:val="en-US"/>
+        </w:rPr>
+        <w:t>data/raw/.gitignore</w:t>
+      </w:r>
+    </w:p>
+    <w:p>
+      <w:pPr>
+        <w:pStyle w:val="ListParagraph"/>
+        <w:numPr>
+          <w:ilvl w:val="1"/>
+          <w:numId w:val="4"/>
+        </w:numPr>
+        <w:rPr>
+          <w:sz w:val="36"/>
+          <w:szCs w:val="36"/>
+          <w:lang w:val="en-US"/>
+        </w:rPr>
+      </w:pPr>
+      <w:r>
+        <w:rPr>
+          <w:sz w:val="36"/>
+          <w:szCs w:val="36"/>
+        </w:rPr>
+        <w:t>git status</w:t>
+      </w:r>
+    </w:p>
+    <w:p>
+      <w:pPr>
+        <w:pStyle w:val="ListParagraph"/>
+        <w:numPr>
+          <w:ilvl w:val="1"/>
+          <w:numId w:val="4"/>
+        </w:numPr>
+        <w:rPr>
+          <w:sz w:val="36"/>
+          <w:szCs w:val="36"/>
+          <w:lang w:val="en-US"/>
+        </w:rPr>
+      </w:pPr>
+      <w:r>
+        <w:rPr>
+          <w:sz w:val="36"/>
+          <w:szCs w:val="36"/>
+          <w:lang w:val="en-US"/>
+        </w:rPr>
+        <w:t>git add file/folder</w:t>
+      </w:r>
+    </w:p>
+    <w:p>
+      <w:pPr>
+        <w:pStyle w:val="ListParagraph"/>
+        <w:numPr>
+          <w:ilvl w:val="1"/>
+          <w:numId w:val="4"/>
+        </w:numPr>
+        <w:rPr>
+          <w:sz w:val="36"/>
+          <w:szCs w:val="36"/>
+          <w:lang w:val="en-US"/>
+        </w:rPr>
+      </w:pPr>
+      <w:r>
+        <w:rPr>
+          <w:sz w:val="36"/>
+          <w:szCs w:val="36"/>
+          <w:lang w:val="en-US"/>
+        </w:rPr>
+        <w:t>git commit -m “”</w:t>
+      </w:r>
+    </w:p>
+    <w:p>
+      <w:pPr>
+        <w:pStyle w:val="ListParagraph"/>
+        <w:numPr>
+          <w:ilvl w:val="1"/>
+          <w:numId w:val="4"/>
+        </w:numPr>
+        <w:rPr>
+          <w:sz w:val="36"/>
+          <w:szCs w:val="36"/>
+          <w:lang w:val="en-US"/>
+        </w:rPr>
+      </w:pPr>
+      <w:r>
+        <w:rPr>
+          <w:sz w:val="36"/>
+          <w:szCs w:val="36"/>
+          <w:lang w:val="en-US"/>
+        </w:rPr>
+        <w:t>git push</w:t>
+      </w:r>
+    </w:p>
+    <w:p>
+      <w:pPr>
+        <w:rPr>
+          <w:sz w:val="36"/>
+          <w:szCs w:val="36"/>
+          <w:lang w:val="en-US"/>
+        </w:rPr>
+      </w:pPr>
+    </w:p>
+    <w:p>
+      <w:pPr>
+        <w:pStyle w:val="ListParagraph"/>
+        <w:numPr>
+          <w:ilvl w:val="0"/>
+          <w:numId w:val="4"/>
+        </w:numPr>
+        <w:rPr>
+          <w:sz w:val="36"/>
+          <w:szCs w:val="36"/>
+          <w:lang w:val="en-US"/>
+        </w:rPr>
+      </w:pPr>
+      <w:r>
+        <w:rPr>
+          <w:sz w:val="36"/>
+          <w:szCs w:val="36"/>
+          <w:lang w:val="en-US"/>
+        </w:rPr>
+        <w:t>Create notebooks/preprocess.ipynb</w:t>
+      </w:r>
+      <w:r>
+        <w:rPr>
+          <w:sz w:val="36"/>
+          <w:szCs w:val="36"/>
+          <w:lang w:val="en-US"/>
+        </w:rPr>
+        <w:t xml:space="preserve"> and after ensuring it works properly, create src/preprocess.py</w:t>
+      </w:r>
+    </w:p>
+    <w:p>
+      <w:pPr>
+        <w:pStyle w:val="ListParagraph"/>
+        <w:numPr>
+          <w:ilvl w:val="0"/>
+          <w:numId w:val="4"/>
+        </w:numPr>
+        <w:rPr>
+          <w:sz w:val="36"/>
+          <w:szCs w:val="36"/>
+          <w:lang w:val="en-US"/>
+        </w:rPr>
+      </w:pPr>
+      <w:r>
+        <w:rPr>
+          <w:sz w:val="36"/>
+          <w:szCs w:val="36"/>
+          <w:lang w:val="en-US"/>
+        </w:rPr>
+        <w:t>Update dvc.yaml again</w:t>
+      </w:r>
+    </w:p>
+    <w:p>
+      <w:pPr>
+        <w:pStyle w:val="ListParagraph"/>
+        <w:numPr>
+          <w:ilvl w:val="0"/>
+          <w:numId w:val="4"/>
+        </w:numPr>
+        <w:rPr>
+          <w:sz w:val="36"/>
+          <w:szCs w:val="36"/>
+          <w:lang w:val="en-US"/>
+        </w:rPr>
+      </w:pPr>
+      <w:r>
+        <w:rPr>
+          <w:sz w:val="36"/>
+          <w:szCs w:val="36"/>
+          <w:lang w:val="en-US"/>
+        </w:rPr>
+        <w:t>dvc repro</w:t>
+      </w:r>
+    </w:p>
+    <w:p>
+      <w:pPr>
+        <w:pStyle w:val="ListParagraph"/>
+        <w:numPr>
+          <w:ilvl w:val="0"/>
+          <w:numId w:val="4"/>
+        </w:numPr>
+        <w:rPr>
+          <w:sz w:val="36"/>
+          <w:szCs w:val="36"/>
+          <w:lang w:val="en-US"/>
+        </w:rPr>
+      </w:pPr>
+      <w:r>
+        <w:rPr>
+          <w:sz w:val="36"/>
+          <w:szCs w:val="36"/>
+          <w:lang w:val="en-US"/>
+        </w:rPr>
+        <w:t>dvc adds the output files of preprocess.py and starts tracking them.</w:t>
+      </w:r>
+    </w:p>
+    <w:p>
+      <w:pPr>
+        <w:pStyle w:val="ListParagraph"/>
+        <w:numPr>
+          <w:ilvl w:val="0"/>
+          <w:numId w:val="4"/>
+        </w:numPr>
+        <w:rPr>
+          <w:sz w:val="36"/>
+          <w:szCs w:val="36"/>
+          <w:lang w:val="en-US"/>
+        </w:rPr>
+      </w:pPr>
+      <w:r>
+        <w:rPr>
+          <w:sz w:val="36"/>
+          <w:szCs w:val="36"/>
+          <w:lang w:val="en-US"/>
+        </w:rPr>
+        <w:t>git status</w:t>
+      </w:r>
+    </w:p>
+    <w:p>
+      <w:pPr>
+        <w:pStyle w:val="ListParagraph"/>
+        <w:numPr>
+          <w:ilvl w:val="0"/>
+          <w:numId w:val="4"/>
+        </w:numPr>
+        <w:rPr>
+          <w:sz w:val="36"/>
+          <w:szCs w:val="36"/>
+          <w:lang w:val="en-US"/>
+        </w:rPr>
+      </w:pPr>
+      <w:r>
+        <w:rPr>
+          <w:sz w:val="36"/>
+          <w:szCs w:val="36"/>
+          <w:lang w:val="en-US"/>
+        </w:rPr>
+        <w:t>git add file/folder</w:t>
+      </w:r>
+    </w:p>
+    <w:p>
+      <w:pPr>
+        <w:pStyle w:val="ListParagraph"/>
+        <w:numPr>
+          <w:ilvl w:val="0"/>
+          <w:numId w:val="4"/>
+        </w:numPr>
+        <w:rPr>
+          <w:sz w:val="36"/>
+          <w:szCs w:val="36"/>
+          <w:lang w:val="en-US"/>
+        </w:rPr>
+      </w:pPr>
+      <w:r>
+        <w:rPr>
+          <w:sz w:val="36"/>
+          <w:szCs w:val="36"/>
+          <w:lang w:val="en-US"/>
+        </w:rPr>
+        <w:t>git commit -m “”</w:t>
+      </w:r>
+    </w:p>
+    <w:p>
+      <w:pPr>
+        <w:pStyle w:val="ListParagraph"/>
+        <w:numPr>
+          <w:ilvl w:val="0"/>
+          <w:numId w:val="4"/>
+        </w:numPr>
+        <w:rPr>
+          <w:sz w:val="36"/>
+          <w:szCs w:val="36"/>
+          <w:lang w:val="en-US"/>
+        </w:rPr>
+      </w:pPr>
+      <w:r>
+        <w:rPr>
+          <w:sz w:val="36"/>
+          <w:szCs w:val="36"/>
+          <w:lang w:val="en-US"/>
+        </w:rPr>
+        <w:t>git push</w:t>
+      </w:r>
     </w:p>
     <w:sectPr>
       <w:pgSz w:w="11906" w:h="16838"/>
@@ -1281,7 +2143,7 @@
         <w:rFonts w:hint="default"/>
       </w:rPr>
     </w:lvl>
-    <w:lvl w:ilvl="1" w:tplc="40090019" w:tentative="1">
+    <w:lvl w:ilvl="1" w:tplc="40090019">
       <w:start w:val="1"/>
       <w:numFmt w:val="lowerLetter"/>
       <w:lvlText w:val="%2."/>

</xml_diff>